<commit_message>
Updated description of subject area
</commit_message>
<xml_diff>
--- a/Task/Docs/Описание предметной области.docx
+++ b/Task/Docs/Описание предметной области.docx
@@ -4667,10 +4667,10 @@
         <w:tblLook w:val="04A0" w:firstRow="1" w:lastRow="0" w:firstColumn="1" w:lastColumn="0" w:noHBand="0" w:noVBand="1"/>
       </w:tblPr>
       <w:tblGrid>
-        <w:gridCol w:w="2325"/>
-        <w:gridCol w:w="1070"/>
+        <w:gridCol w:w="3145"/>
+        <w:gridCol w:w="1191"/>
         <w:gridCol w:w="1790"/>
-        <w:gridCol w:w="4443"/>
+        <w:gridCol w:w="3376"/>
       </w:tblGrid>
       <w:tr>
         <w:tc>
@@ -4788,7 +4788,7 @@
       </w:tr>
       <w:tr>
         <w:trPr>
-          <w:trHeight w:val="910"/>
+          <w:trHeight w:val="613"/>
         </w:trPr>
         <w:tc>
           <w:tcPr>
@@ -4908,87 +4908,8 @@
                 <w:rFonts w:ascii="Times New Roman" w:hAnsi="Times New Roman" w:cs="Times New Roman"/>
                 <w:sz w:val="24"/>
                 <w:szCs w:val="24"/>
-                <w:lang w:val="en-US"/>
-              </w:rPr>
-              <w:t xml:space="preserve">PRIMARY KEY, </w:t>
-            </w:r>
-            <w:r>
-              <w:rPr>
-                <w:rFonts w:ascii="Times New Roman" w:hAnsi="Times New Roman" w:cs="Times New Roman"/>
-                <w:sz w:val="24"/>
-                <w:szCs w:val="24"/>
-                <w:lang w:val="en-US"/>
-              </w:rPr>
-              <w:t>(</w:t>
-            </w:r>
-            <w:r>
-              <w:rPr>
-                <w:rFonts w:ascii="Times New Roman" w:hAnsi="Times New Roman" w:cs="Times New Roman"/>
-                <w:sz w:val="24"/>
-                <w:szCs w:val="24"/>
-              </w:rPr>
-              <w:t>Суррогатный</w:t>
-            </w:r>
-            <w:r>
-              <w:rPr>
-                <w:rFonts w:ascii="Times New Roman" w:hAnsi="Times New Roman" w:cs="Times New Roman"/>
-                <w:sz w:val="24"/>
-                <w:szCs w:val="24"/>
-                <w:lang w:val="en-US"/>
-              </w:rPr>
-              <w:t xml:space="preserve"> </w:t>
-            </w:r>
-            <w:r>
-              <w:rPr>
-                <w:rFonts w:ascii="Times New Roman" w:hAnsi="Times New Roman" w:cs="Times New Roman"/>
-                <w:sz w:val="24"/>
-                <w:szCs w:val="24"/>
-              </w:rPr>
-              <w:t>первичный</w:t>
-            </w:r>
-            <w:r>
-              <w:rPr>
-                <w:rFonts w:ascii="Times New Roman" w:hAnsi="Times New Roman" w:cs="Times New Roman"/>
-                <w:sz w:val="24"/>
-                <w:szCs w:val="24"/>
-                <w:lang w:val="en-US"/>
-              </w:rPr>
-              <w:t xml:space="preserve"> </w:t>
-            </w:r>
-            <w:r>
-              <w:rPr>
-                <w:rFonts w:ascii="Times New Roman" w:hAnsi="Times New Roman" w:cs="Times New Roman"/>
-                <w:sz w:val="24"/>
-                <w:szCs w:val="24"/>
-              </w:rPr>
-              <w:t>ключ</w:t>
-            </w:r>
-            <w:r>
-              <w:rPr>
-                <w:rFonts w:ascii="Times New Roman" w:hAnsi="Times New Roman" w:cs="Times New Roman"/>
-                <w:sz w:val="24"/>
-                <w:szCs w:val="24"/>
-                <w:lang w:val="en-US"/>
-              </w:rPr>
-              <w:t>)</w:t>
-            </w:r>
-            <w:r>
-              <w:rPr>
-                <w:rFonts w:ascii="Times New Roman" w:hAnsi="Times New Roman" w:cs="Times New Roman"/>
-                <w:sz w:val="24"/>
-                <w:szCs w:val="24"/>
-                <w:lang w:val="en-US"/>
-              </w:rPr>
-              <w:t xml:space="preserve"> </w:t>
-            </w:r>
-            <w:r>
-              <w:rPr>
-                <w:rFonts w:ascii="Times New Roman" w:hAnsi="Times New Roman" w:cs="Times New Roman"/>
-                <w:sz w:val="24"/>
-                <w:szCs w:val="24"/>
-                <w:lang w:val="en-US"/>
-              </w:rPr>
-              <w:t>AUTO_INCREMENT</w:t>
+              </w:rPr>
+              <w:t>Суррогатный первичный ключ</w:t>
             </w:r>
           </w:p>
         </w:tc>
@@ -5161,10 +5082,10 @@
         <w:tblLook w:val="04A0" w:firstRow="1" w:lastRow="0" w:firstColumn="1" w:lastColumn="0" w:noHBand="0" w:noVBand="1"/>
       </w:tblPr>
       <w:tblGrid>
-        <w:gridCol w:w="2722"/>
+        <w:gridCol w:w="3067"/>
         <w:gridCol w:w="1496"/>
         <w:gridCol w:w="1790"/>
-        <w:gridCol w:w="3620"/>
+        <w:gridCol w:w="3275"/>
       </w:tblGrid>
       <w:tr>
         <w:trPr>
@@ -5311,7 +5232,6 @@
                 <w:sz w:val="24"/>
                 <w:szCs w:val="24"/>
               </w:rPr>
-              <w:lastRenderedPageBreak/>
               <w:t>Уникальный идентификатор</w:t>
             </w:r>
           </w:p>
@@ -5372,6 +5292,14 @@
               </w:rPr>
               <w:t>INT</w:t>
             </w:r>
+            <w:r>
+              <w:rPr>
+                <w:rFonts w:ascii="Times New Roman" w:hAnsi="Times New Roman" w:cs="Times New Roman"/>
+                <w:sz w:val="24"/>
+                <w:szCs w:val="24"/>
+              </w:rPr>
+              <w:t xml:space="preserve"> (4)</w:t>
+            </w:r>
           </w:p>
         </w:tc>
         <w:tc>
@@ -5398,7 +5326,7 @@
                 <w:sz w:val="24"/>
                 <w:szCs w:val="24"/>
               </w:rPr>
-              <w:t>PRIMARY KEY, AUTO_INCREMENT</w:t>
+              <w:t>Суррогатный первичный ключ</w:t>
             </w:r>
           </w:p>
         </w:tc>
@@ -5543,6 +5471,7 @@
           <w:sz w:val="28"/>
           <w:szCs w:val="28"/>
         </w:rPr>
+        <w:lastRenderedPageBreak/>
         <w:t xml:space="preserve">Таблица 5.3 – </w:t>
       </w:r>
       <w:proofErr w:type="spellStart"/>
@@ -5571,10 +5500,10 @@
         <w:tblLook w:val="04A0" w:firstRow="1" w:lastRow="0" w:firstColumn="1" w:lastColumn="0" w:noHBand="0" w:noVBand="1"/>
       </w:tblPr>
       <w:tblGrid>
-        <w:gridCol w:w="2624"/>
+        <w:gridCol w:w="2968"/>
         <w:gridCol w:w="1603"/>
         <w:gridCol w:w="1910"/>
-        <w:gridCol w:w="3491"/>
+        <w:gridCol w:w="3147"/>
       </w:tblGrid>
       <w:tr>
         <w:tc>
@@ -5775,6 +5704,14 @@
               </w:rPr>
               <w:t>INT</w:t>
             </w:r>
+            <w:r>
+              <w:rPr>
+                <w:rFonts w:ascii="Times New Roman" w:hAnsi="Times New Roman" w:cs="Times New Roman"/>
+                <w:sz w:val="24"/>
+                <w:szCs w:val="24"/>
+              </w:rPr>
+              <w:t xml:space="preserve"> (4)</w:t>
+            </w:r>
           </w:p>
         </w:tc>
         <w:tc>
@@ -5801,7 +5738,7 @@
                 <w:sz w:val="24"/>
                 <w:szCs w:val="24"/>
               </w:rPr>
-              <w:t>PRIMARY KEY, AUTO_INCREMENT</w:t>
+              <w:t>Суррогатный первичный ключ</w:t>
             </w:r>
           </w:p>
         </w:tc>
@@ -6319,10 +6256,10 @@
         <w:tblLook w:val="04A0" w:firstRow="1" w:lastRow="0" w:firstColumn="1" w:lastColumn="0" w:noHBand="0" w:noVBand="1"/>
       </w:tblPr>
       <w:tblGrid>
-        <w:gridCol w:w="2548"/>
+        <w:gridCol w:w="2893"/>
         <w:gridCol w:w="1896"/>
         <w:gridCol w:w="1790"/>
-        <w:gridCol w:w="3394"/>
+        <w:gridCol w:w="3049"/>
       </w:tblGrid>
       <w:tr>
         <w:tc>
@@ -6523,6 +6460,14 @@
               </w:rPr>
               <w:t>INT</w:t>
             </w:r>
+            <w:r>
+              <w:rPr>
+                <w:rFonts w:ascii="Times New Roman" w:hAnsi="Times New Roman" w:cs="Times New Roman"/>
+                <w:sz w:val="24"/>
+                <w:szCs w:val="24"/>
+              </w:rPr>
+              <w:t xml:space="preserve"> (4)</w:t>
+            </w:r>
           </w:p>
         </w:tc>
         <w:tc>
@@ -6549,7 +6494,7 @@
                 <w:sz w:val="24"/>
                 <w:szCs w:val="24"/>
               </w:rPr>
-              <w:t>PRIMARY KEY, AUTO_INCREMENT</w:t>
+              <w:t>Суррогатный первичный ключ</w:t>
             </w:r>
           </w:p>
         </w:tc>
@@ -6719,10 +6664,10 @@
         <w:tblLook w:val="04A0" w:firstRow="1" w:lastRow="0" w:firstColumn="1" w:lastColumn="0" w:noHBand="0" w:noVBand="1"/>
       </w:tblPr>
       <w:tblGrid>
-        <w:gridCol w:w="2376"/>
+        <w:gridCol w:w="2399"/>
         <w:gridCol w:w="1310"/>
         <w:gridCol w:w="1910"/>
-        <w:gridCol w:w="4032"/>
+        <w:gridCol w:w="4009"/>
       </w:tblGrid>
       <w:tr>
         <w:tc>
@@ -6923,6 +6868,14 @@
               </w:rPr>
               <w:t>INT</w:t>
             </w:r>
+            <w:r>
+              <w:rPr>
+                <w:rFonts w:ascii="Times New Roman" w:hAnsi="Times New Roman" w:cs="Times New Roman"/>
+                <w:sz w:val="24"/>
+                <w:szCs w:val="24"/>
+              </w:rPr>
+              <w:t xml:space="preserve"> (4)</w:t>
+            </w:r>
           </w:p>
         </w:tc>
         <w:tc>
@@ -6949,7 +6902,7 @@
                 <w:sz w:val="24"/>
                 <w:szCs w:val="24"/>
               </w:rPr>
-              <w:t>PRIMARY KEY, AUTO_INCREMENT</w:t>
+              <w:t>Суррогатный первичный ключ</w:t>
             </w:r>
           </w:p>
         </w:tc>
@@ -7664,6 +7617,499 @@
           <w:szCs w:val="28"/>
         </w:rPr>
         <w:t>Таблица 5.6 – Products (Список товаров)</w:t>
+      </w:r>
+    </w:p>
+    <w:tbl>
+      <w:tblPr>
+        <w:tblStyle w:val="ab"/>
+        <w:tblW w:w="9634" w:type="dxa"/>
+        <w:tblLook w:val="04A0" w:firstRow="1" w:lastRow="0" w:firstColumn="1" w:lastColumn="0" w:noHBand="0" w:noVBand="1"/>
+      </w:tblPr>
+      <w:tblGrid>
+        <w:gridCol w:w="2405"/>
+        <w:gridCol w:w="1276"/>
+        <w:gridCol w:w="1984"/>
+        <w:gridCol w:w="3969"/>
+      </w:tblGrid>
+      <w:tr>
+        <w:tc>
+          <w:tcPr>
+            <w:tcW w:w="2405" w:type="dxa"/>
+            <w:hideMark/>
+          </w:tcPr>
+          <w:p>
+            <w:pPr>
+              <w:tabs>
+                <w:tab w:val="left" w:pos="851"/>
+              </w:tabs>
+              <w:spacing w:line="360" w:lineRule="auto"/>
+              <w:jc w:val="center"/>
+              <w:rPr>
+                <w:rFonts w:ascii="Times New Roman" w:hAnsi="Times New Roman" w:cs="Times New Roman"/>
+                <w:sz w:val="24"/>
+                <w:szCs w:val="24"/>
+              </w:rPr>
+            </w:pPr>
+            <w:r>
+              <w:rPr>
+                <w:rFonts w:ascii="Times New Roman" w:hAnsi="Times New Roman" w:cs="Times New Roman"/>
+                <w:sz w:val="24"/>
+                <w:szCs w:val="24"/>
+              </w:rPr>
+              <w:t>Содержание поля</w:t>
+            </w:r>
+          </w:p>
+        </w:tc>
+        <w:tc>
+          <w:tcPr>
+            <w:tcW w:w="1276" w:type="dxa"/>
+            <w:hideMark/>
+          </w:tcPr>
+          <w:p>
+            <w:pPr>
+              <w:tabs>
+                <w:tab w:val="left" w:pos="851"/>
+              </w:tabs>
+              <w:spacing w:line="360" w:lineRule="auto"/>
+              <w:jc w:val="center"/>
+              <w:rPr>
+                <w:rFonts w:ascii="Times New Roman" w:hAnsi="Times New Roman" w:cs="Times New Roman"/>
+                <w:sz w:val="24"/>
+                <w:szCs w:val="24"/>
+              </w:rPr>
+            </w:pPr>
+            <w:r>
+              <w:rPr>
+                <w:rFonts w:ascii="Times New Roman" w:hAnsi="Times New Roman" w:cs="Times New Roman"/>
+                <w:sz w:val="24"/>
+                <w:szCs w:val="24"/>
+              </w:rPr>
+              <w:t>Имя поля</w:t>
+            </w:r>
+          </w:p>
+        </w:tc>
+        <w:tc>
+          <w:tcPr>
+            <w:tcW w:w="1984" w:type="dxa"/>
+            <w:hideMark/>
+          </w:tcPr>
+          <w:p>
+            <w:pPr>
+              <w:tabs>
+                <w:tab w:val="left" w:pos="851"/>
+              </w:tabs>
+              <w:spacing w:line="360" w:lineRule="auto"/>
+              <w:jc w:val="center"/>
+              <w:rPr>
+                <w:rFonts w:ascii="Times New Roman" w:hAnsi="Times New Roman" w:cs="Times New Roman"/>
+                <w:sz w:val="24"/>
+                <w:szCs w:val="24"/>
+              </w:rPr>
+            </w:pPr>
+            <w:r>
+              <w:rPr>
+                <w:rFonts w:ascii="Times New Roman" w:hAnsi="Times New Roman" w:cs="Times New Roman"/>
+                <w:sz w:val="24"/>
+                <w:szCs w:val="24"/>
+              </w:rPr>
+              <w:t>Тип, длина</w:t>
+            </w:r>
+          </w:p>
+        </w:tc>
+        <w:tc>
+          <w:tcPr>
+            <w:tcW w:w="3969" w:type="dxa"/>
+            <w:hideMark/>
+          </w:tcPr>
+          <w:p>
+            <w:pPr>
+              <w:tabs>
+                <w:tab w:val="left" w:pos="851"/>
+              </w:tabs>
+              <w:spacing w:line="360" w:lineRule="auto"/>
+              <w:jc w:val="center"/>
+              <w:rPr>
+                <w:rFonts w:ascii="Times New Roman" w:hAnsi="Times New Roman" w:cs="Times New Roman"/>
+                <w:sz w:val="24"/>
+                <w:szCs w:val="24"/>
+              </w:rPr>
+            </w:pPr>
+            <w:r>
+              <w:rPr>
+                <w:rFonts w:ascii="Times New Roman" w:hAnsi="Times New Roman" w:cs="Times New Roman"/>
+                <w:sz w:val="24"/>
+                <w:szCs w:val="24"/>
+              </w:rPr>
+              <w:t>Примечания</w:t>
+            </w:r>
+          </w:p>
+        </w:tc>
+      </w:tr>
+      <w:tr>
+        <w:tc>
+          <w:tcPr>
+            <w:tcW w:w="2405" w:type="dxa"/>
+          </w:tcPr>
+          <w:p>
+            <w:pPr>
+              <w:tabs>
+                <w:tab w:val="left" w:pos="851"/>
+              </w:tabs>
+              <w:spacing w:line="360" w:lineRule="auto"/>
+              <w:jc w:val="center"/>
+              <w:rPr>
+                <w:rFonts w:ascii="Times New Roman" w:hAnsi="Times New Roman" w:cs="Times New Roman"/>
+                <w:sz w:val="24"/>
+                <w:szCs w:val="24"/>
+              </w:rPr>
+            </w:pPr>
+            <w:r>
+              <w:rPr>
+                <w:rFonts w:ascii="Times New Roman" w:hAnsi="Times New Roman" w:cs="Times New Roman"/>
+                <w:sz w:val="24"/>
+                <w:szCs w:val="24"/>
+              </w:rPr>
+              <w:t>1</w:t>
+            </w:r>
+          </w:p>
+        </w:tc>
+        <w:tc>
+          <w:tcPr>
+            <w:tcW w:w="1276" w:type="dxa"/>
+          </w:tcPr>
+          <w:p>
+            <w:pPr>
+              <w:tabs>
+                <w:tab w:val="left" w:pos="851"/>
+              </w:tabs>
+              <w:spacing w:line="360" w:lineRule="auto"/>
+              <w:jc w:val="center"/>
+              <w:rPr>
+                <w:rFonts w:ascii="Times New Roman" w:hAnsi="Times New Roman" w:cs="Times New Roman"/>
+                <w:sz w:val="24"/>
+                <w:szCs w:val="24"/>
+              </w:rPr>
+            </w:pPr>
+            <w:r>
+              <w:rPr>
+                <w:rFonts w:ascii="Times New Roman" w:hAnsi="Times New Roman" w:cs="Times New Roman"/>
+                <w:sz w:val="24"/>
+                <w:szCs w:val="24"/>
+              </w:rPr>
+              <w:t>2</w:t>
+            </w:r>
+          </w:p>
+        </w:tc>
+        <w:tc>
+          <w:tcPr>
+            <w:tcW w:w="1984" w:type="dxa"/>
+          </w:tcPr>
+          <w:p>
+            <w:pPr>
+              <w:tabs>
+                <w:tab w:val="left" w:pos="851"/>
+              </w:tabs>
+              <w:spacing w:line="360" w:lineRule="auto"/>
+              <w:jc w:val="center"/>
+              <w:rPr>
+                <w:rFonts w:ascii="Times New Roman" w:hAnsi="Times New Roman" w:cs="Times New Roman"/>
+                <w:sz w:val="24"/>
+                <w:szCs w:val="24"/>
+              </w:rPr>
+            </w:pPr>
+            <w:r>
+              <w:rPr>
+                <w:rFonts w:ascii="Times New Roman" w:hAnsi="Times New Roman" w:cs="Times New Roman"/>
+                <w:sz w:val="24"/>
+                <w:szCs w:val="24"/>
+              </w:rPr>
+              <w:t>3</w:t>
+            </w:r>
+          </w:p>
+        </w:tc>
+        <w:tc>
+          <w:tcPr>
+            <w:tcW w:w="3969" w:type="dxa"/>
+          </w:tcPr>
+          <w:p>
+            <w:pPr>
+              <w:tabs>
+                <w:tab w:val="left" w:pos="851"/>
+              </w:tabs>
+              <w:spacing w:line="360" w:lineRule="auto"/>
+              <w:jc w:val="center"/>
+              <w:rPr>
+                <w:rFonts w:ascii="Times New Roman" w:hAnsi="Times New Roman" w:cs="Times New Roman"/>
+                <w:sz w:val="24"/>
+                <w:szCs w:val="24"/>
+              </w:rPr>
+            </w:pPr>
+            <w:r>
+              <w:rPr>
+                <w:rFonts w:ascii="Times New Roman" w:hAnsi="Times New Roman" w:cs="Times New Roman"/>
+                <w:sz w:val="24"/>
+                <w:szCs w:val="24"/>
+              </w:rPr>
+              <w:t>4</w:t>
+            </w:r>
+          </w:p>
+        </w:tc>
+      </w:tr>
+      <w:tr>
+        <w:tc>
+          <w:tcPr>
+            <w:tcW w:w="2405" w:type="dxa"/>
+            <w:hideMark/>
+          </w:tcPr>
+          <w:p>
+            <w:pPr>
+              <w:tabs>
+                <w:tab w:val="left" w:pos="851"/>
+              </w:tabs>
+              <w:spacing w:line="360" w:lineRule="auto"/>
+              <w:jc w:val="center"/>
+              <w:rPr>
+                <w:rFonts w:ascii="Times New Roman" w:hAnsi="Times New Roman" w:cs="Times New Roman"/>
+                <w:sz w:val="24"/>
+                <w:szCs w:val="24"/>
+              </w:rPr>
+            </w:pPr>
+            <w:r>
+              <w:rPr>
+                <w:rFonts w:ascii="Times New Roman" w:hAnsi="Times New Roman" w:cs="Times New Roman"/>
+                <w:sz w:val="24"/>
+                <w:szCs w:val="24"/>
+              </w:rPr>
+              <w:t>Артикул товара</w:t>
+            </w:r>
+          </w:p>
+        </w:tc>
+        <w:tc>
+          <w:tcPr>
+            <w:tcW w:w="1276" w:type="dxa"/>
+            <w:hideMark/>
+          </w:tcPr>
+          <w:p>
+            <w:pPr>
+              <w:tabs>
+                <w:tab w:val="left" w:pos="851"/>
+              </w:tabs>
+              <w:spacing w:line="360" w:lineRule="auto"/>
+              <w:jc w:val="center"/>
+              <w:rPr>
+                <w:rFonts w:ascii="Times New Roman" w:hAnsi="Times New Roman" w:cs="Times New Roman"/>
+                <w:sz w:val="24"/>
+                <w:szCs w:val="24"/>
+              </w:rPr>
+            </w:pPr>
+            <w:proofErr w:type="spellStart"/>
+            <w:r>
+              <w:rPr>
+                <w:rFonts w:ascii="Times New Roman" w:hAnsi="Times New Roman" w:cs="Times New Roman"/>
+                <w:sz w:val="24"/>
+                <w:szCs w:val="24"/>
+              </w:rPr>
+              <w:t>article</w:t>
+            </w:r>
+            <w:proofErr w:type="spellEnd"/>
+          </w:p>
+        </w:tc>
+        <w:tc>
+          <w:tcPr>
+            <w:tcW w:w="1984" w:type="dxa"/>
+            <w:hideMark/>
+          </w:tcPr>
+          <w:p>
+            <w:pPr>
+              <w:tabs>
+                <w:tab w:val="left" w:pos="851"/>
+              </w:tabs>
+              <w:spacing w:line="360" w:lineRule="auto"/>
+              <w:jc w:val="center"/>
+              <w:rPr>
+                <w:rFonts w:ascii="Times New Roman" w:hAnsi="Times New Roman" w:cs="Times New Roman"/>
+                <w:sz w:val="24"/>
+                <w:szCs w:val="24"/>
+              </w:rPr>
+            </w:pPr>
+            <w:r>
+              <w:rPr>
+                <w:rFonts w:ascii="Times New Roman" w:hAnsi="Times New Roman" w:cs="Times New Roman"/>
+                <w:sz w:val="24"/>
+                <w:szCs w:val="24"/>
+              </w:rPr>
+              <w:t>VARCHAR(10)</w:t>
+            </w:r>
+          </w:p>
+        </w:tc>
+        <w:tc>
+          <w:tcPr>
+            <w:tcW w:w="3969" w:type="dxa"/>
+            <w:hideMark/>
+          </w:tcPr>
+          <w:p>
+            <w:pPr>
+              <w:tabs>
+                <w:tab w:val="left" w:pos="851"/>
+              </w:tabs>
+              <w:spacing w:line="360" w:lineRule="auto"/>
+              <w:jc w:val="center"/>
+              <w:rPr>
+                <w:rFonts w:ascii="Times New Roman" w:hAnsi="Times New Roman" w:cs="Times New Roman"/>
+                <w:sz w:val="24"/>
+                <w:szCs w:val="24"/>
+              </w:rPr>
+            </w:pPr>
+            <w:r>
+              <w:rPr>
+                <w:rFonts w:ascii="Times New Roman" w:hAnsi="Times New Roman" w:cs="Times New Roman"/>
+                <w:sz w:val="24"/>
+                <w:szCs w:val="24"/>
+              </w:rPr>
+              <w:t>Первичный ключ</w:t>
+            </w:r>
+          </w:p>
+        </w:tc>
+      </w:tr>
+      <w:tr>
+        <w:tc>
+          <w:tcPr>
+            <w:tcW w:w="2405" w:type="dxa"/>
+            <w:hideMark/>
+          </w:tcPr>
+          <w:p>
+            <w:pPr>
+              <w:tabs>
+                <w:tab w:val="left" w:pos="851"/>
+              </w:tabs>
+              <w:spacing w:line="360" w:lineRule="auto"/>
+              <w:jc w:val="center"/>
+              <w:rPr>
+                <w:rFonts w:ascii="Times New Roman" w:hAnsi="Times New Roman" w:cs="Times New Roman"/>
+                <w:sz w:val="24"/>
+                <w:szCs w:val="24"/>
+              </w:rPr>
+            </w:pPr>
+            <w:r>
+              <w:rPr>
+                <w:rFonts w:ascii="Times New Roman" w:hAnsi="Times New Roman" w:cs="Times New Roman"/>
+                <w:sz w:val="24"/>
+                <w:szCs w:val="24"/>
+              </w:rPr>
+              <w:t>Название товара</w:t>
+            </w:r>
+          </w:p>
+        </w:tc>
+        <w:tc>
+          <w:tcPr>
+            <w:tcW w:w="1276" w:type="dxa"/>
+            <w:hideMark/>
+          </w:tcPr>
+          <w:p>
+            <w:pPr>
+              <w:tabs>
+                <w:tab w:val="left" w:pos="851"/>
+              </w:tabs>
+              <w:spacing w:line="360" w:lineRule="auto"/>
+              <w:jc w:val="center"/>
+              <w:rPr>
+                <w:rFonts w:ascii="Times New Roman" w:hAnsi="Times New Roman" w:cs="Times New Roman"/>
+                <w:sz w:val="24"/>
+                <w:szCs w:val="24"/>
+              </w:rPr>
+            </w:pPr>
+            <w:proofErr w:type="spellStart"/>
+            <w:r>
+              <w:rPr>
+                <w:rFonts w:ascii="Times New Roman" w:hAnsi="Times New Roman" w:cs="Times New Roman"/>
+                <w:sz w:val="24"/>
+                <w:szCs w:val="24"/>
+              </w:rPr>
+              <w:t>product</w:t>
+            </w:r>
+            <w:proofErr w:type="spellEnd"/>
+          </w:p>
+        </w:tc>
+        <w:tc>
+          <w:tcPr>
+            <w:tcW w:w="1984" w:type="dxa"/>
+            <w:hideMark/>
+          </w:tcPr>
+          <w:p>
+            <w:pPr>
+              <w:tabs>
+                <w:tab w:val="left" w:pos="851"/>
+              </w:tabs>
+              <w:spacing w:line="360" w:lineRule="auto"/>
+              <w:jc w:val="center"/>
+              <w:rPr>
+                <w:rFonts w:ascii="Times New Roman" w:hAnsi="Times New Roman" w:cs="Times New Roman"/>
+                <w:sz w:val="24"/>
+                <w:szCs w:val="24"/>
+              </w:rPr>
+            </w:pPr>
+            <w:r>
+              <w:rPr>
+                <w:rFonts w:ascii="Times New Roman" w:hAnsi="Times New Roman" w:cs="Times New Roman"/>
+                <w:sz w:val="24"/>
+                <w:szCs w:val="24"/>
+              </w:rPr>
+              <w:t>VARCHAR(45)</w:t>
+            </w:r>
+          </w:p>
+        </w:tc>
+        <w:tc>
+          <w:tcPr>
+            <w:tcW w:w="3969" w:type="dxa"/>
+            <w:hideMark/>
+          </w:tcPr>
+          <w:p>
+            <w:pPr>
+              <w:tabs>
+                <w:tab w:val="left" w:pos="851"/>
+              </w:tabs>
+              <w:spacing w:line="360" w:lineRule="auto"/>
+              <w:jc w:val="center"/>
+              <w:rPr>
+                <w:rFonts w:ascii="Times New Roman" w:hAnsi="Times New Roman" w:cs="Times New Roman"/>
+                <w:sz w:val="24"/>
+                <w:szCs w:val="24"/>
+              </w:rPr>
+            </w:pPr>
+            <w:r>
+              <w:rPr>
+                <w:rFonts w:ascii="Times New Roman" w:hAnsi="Times New Roman" w:cs="Times New Roman"/>
+                <w:sz w:val="24"/>
+                <w:szCs w:val="24"/>
+              </w:rPr>
+              <w:t>Обязательное поле</w:t>
+            </w:r>
+          </w:p>
+        </w:tc>
+      </w:tr>
+    </w:tbl>
+    <w:p>
+      <w:pPr>
+        <w:tabs>
+          <w:tab w:val="left" w:pos="851"/>
+        </w:tabs>
+        <w:spacing w:before="240" w:after="0" w:line="360" w:lineRule="auto"/>
+        <w:ind w:firstLine="567"/>
+        <w:jc w:val="both"/>
+        <w:rPr>
+          <w:rFonts w:ascii="Times New Roman" w:hAnsi="Times New Roman" w:cs="Times New Roman"/>
+          <w:sz w:val="28"/>
+          <w:szCs w:val="28"/>
+        </w:rPr>
+      </w:pPr>
+      <w:r>
+        <w:rPr>
+          <w:rFonts w:ascii="Times New Roman" w:hAnsi="Times New Roman" w:cs="Times New Roman"/>
+          <w:sz w:val="28"/>
+          <w:szCs w:val="28"/>
+        </w:rPr>
+        <w:lastRenderedPageBreak/>
+        <w:t>Продолжение таблицы 5.6</w:t>
       </w:r>
     </w:p>
     <w:tbl>
@@ -7673,16 +8119,15 @@
         <w:tblLook w:val="04A0" w:firstRow="1" w:lastRow="0" w:firstColumn="1" w:lastColumn="0" w:noHBand="0" w:noVBand="1"/>
       </w:tblPr>
       <w:tblGrid>
-        <w:gridCol w:w="2189"/>
+        <w:gridCol w:w="2138"/>
         <w:gridCol w:w="2202"/>
         <w:gridCol w:w="1910"/>
-        <w:gridCol w:w="3327"/>
+        <w:gridCol w:w="3378"/>
       </w:tblGrid>
       <w:tr>
         <w:tc>
           <w:tcPr>
             <w:tcW w:w="0" w:type="auto"/>
-            <w:hideMark/>
           </w:tcPr>
           <w:p>
             <w:pPr>
@@ -7703,11 +8148,93 @@
                 <w:sz w:val="24"/>
                 <w:szCs w:val="24"/>
               </w:rPr>
-              <w:lastRenderedPageBreak/>
-              <w:t>Содержание поля</w:t>
-            </w:r>
-          </w:p>
-        </w:tc>
+              <w:t>1</w:t>
+            </w:r>
+          </w:p>
+        </w:tc>
+        <w:tc>
+          <w:tcPr>
+            <w:tcW w:w="0" w:type="auto"/>
+          </w:tcPr>
+          <w:p>
+            <w:pPr>
+              <w:tabs>
+                <w:tab w:val="left" w:pos="851"/>
+              </w:tabs>
+              <w:spacing w:line="360" w:lineRule="auto"/>
+              <w:jc w:val="center"/>
+              <w:rPr>
+                <w:rFonts w:ascii="Times New Roman" w:hAnsi="Times New Roman" w:cs="Times New Roman"/>
+                <w:sz w:val="24"/>
+                <w:szCs w:val="24"/>
+              </w:rPr>
+            </w:pPr>
+            <w:r>
+              <w:rPr>
+                <w:rFonts w:ascii="Times New Roman" w:hAnsi="Times New Roman" w:cs="Times New Roman"/>
+                <w:sz w:val="24"/>
+                <w:szCs w:val="24"/>
+              </w:rPr>
+              <w:t>2</w:t>
+            </w:r>
+          </w:p>
+        </w:tc>
+        <w:tc>
+          <w:tcPr>
+            <w:tcW w:w="0" w:type="auto"/>
+          </w:tcPr>
+          <w:p>
+            <w:pPr>
+              <w:tabs>
+                <w:tab w:val="left" w:pos="851"/>
+              </w:tabs>
+              <w:spacing w:line="360" w:lineRule="auto"/>
+              <w:jc w:val="center"/>
+              <w:rPr>
+                <w:rFonts w:ascii="Times New Roman" w:hAnsi="Times New Roman" w:cs="Times New Roman"/>
+                <w:sz w:val="24"/>
+                <w:szCs w:val="24"/>
+              </w:rPr>
+            </w:pPr>
+            <w:r>
+              <w:rPr>
+                <w:rFonts w:ascii="Times New Roman" w:hAnsi="Times New Roman" w:cs="Times New Roman"/>
+                <w:sz w:val="24"/>
+                <w:szCs w:val="24"/>
+              </w:rPr>
+              <w:t>3</w:t>
+            </w:r>
+          </w:p>
+        </w:tc>
+        <w:tc>
+          <w:tcPr>
+            <w:tcW w:w="0" w:type="auto"/>
+          </w:tcPr>
+          <w:p>
+            <w:pPr>
+              <w:tabs>
+                <w:tab w:val="left" w:pos="851"/>
+              </w:tabs>
+              <w:spacing w:line="360" w:lineRule="auto"/>
+              <w:jc w:val="center"/>
+              <w:rPr>
+                <w:rFonts w:ascii="Times New Roman" w:hAnsi="Times New Roman" w:cs="Times New Roman"/>
+                <w:sz w:val="24"/>
+                <w:szCs w:val="24"/>
+              </w:rPr>
+            </w:pPr>
+            <w:r>
+              <w:rPr>
+                <w:rFonts w:ascii="Times New Roman" w:hAnsi="Times New Roman" w:cs="Times New Roman"/>
+                <w:sz w:val="24"/>
+                <w:szCs w:val="24"/>
+              </w:rPr>
+              <w:t>4</w:t>
+            </w:r>
+          </w:p>
+        </w:tc>
+      </w:tr>
+      <w:tr>
         <w:tc>
           <w:tcPr>
             <w:tcW w:w="0" w:type="auto"/>
@@ -7732,7 +8259,7 @@
                 <w:sz w:val="24"/>
                 <w:szCs w:val="24"/>
               </w:rPr>
-              <w:t>Имя поля</w:t>
+              <w:t>Единица измерения</w:t>
             </w:r>
           </w:p>
         </w:tc>
@@ -7760,7 +8287,7 @@
                 <w:sz w:val="24"/>
                 <w:szCs w:val="24"/>
               </w:rPr>
-              <w:t>Тип, длина</w:t>
+              <w:t>unit</w:t>
             </w:r>
           </w:p>
         </w:tc>
@@ -7788,8 +8315,28 @@
                 <w:sz w:val="24"/>
                 <w:szCs w:val="24"/>
               </w:rPr>
-              <w:t>Примечания</w:t>
-            </w:r>
+              <w:t>VARCHAR(10)</w:t>
+            </w:r>
+          </w:p>
+        </w:tc>
+        <w:tc>
+          <w:tcPr>
+            <w:tcW w:w="0" w:type="auto"/>
+            <w:hideMark/>
+          </w:tcPr>
+          <w:p>
+            <w:pPr>
+              <w:tabs>
+                <w:tab w:val="left" w:pos="851"/>
+              </w:tabs>
+              <w:spacing w:line="360" w:lineRule="auto"/>
+              <w:jc w:val="center"/>
+              <w:rPr>
+                <w:rFonts w:ascii="Times New Roman" w:hAnsi="Times New Roman" w:cs="Times New Roman"/>
+                <w:sz w:val="24"/>
+                <w:szCs w:val="24"/>
+              </w:rPr>
+            </w:pPr>
           </w:p>
         </w:tc>
       </w:tr>
@@ -7818,7 +8365,7 @@
                 <w:sz w:val="24"/>
                 <w:szCs w:val="24"/>
               </w:rPr>
-              <w:t>Артикул товара</w:t>
+              <w:t>Цена товара</w:t>
             </w:r>
           </w:p>
         </w:tc>
@@ -7847,7 +8394,7 @@
                 <w:sz w:val="24"/>
                 <w:szCs w:val="24"/>
               </w:rPr>
-              <w:t>article</w:t>
+              <w:t>cost</w:t>
             </w:r>
             <w:proofErr w:type="spellEnd"/>
           </w:p>
@@ -7876,7 +8423,7 @@
                 <w:sz w:val="24"/>
                 <w:szCs w:val="24"/>
               </w:rPr>
-              <w:t>VARCHAR(10)</w:t>
+              <w:t>DECIMAL(10,2)</w:t>
             </w:r>
           </w:p>
         </w:tc>
@@ -7904,7 +8451,7 @@
                 <w:sz w:val="24"/>
                 <w:szCs w:val="24"/>
               </w:rPr>
-              <w:t>PRIMARY KEY</w:t>
+              <w:t>Обязательное поле</w:t>
             </w:r>
           </w:p>
         </w:tc>
@@ -7934,7 +8481,7 @@
                 <w:sz w:val="24"/>
                 <w:szCs w:val="24"/>
               </w:rPr>
-              <w:t>Название товара</w:t>
+              <w:t>Поставщик</w:t>
             </w:r>
           </w:p>
         </w:tc>
@@ -7963,7 +8510,7 @@
                 <w:sz w:val="24"/>
                 <w:szCs w:val="24"/>
               </w:rPr>
-              <w:t>product</w:t>
+              <w:t>supplier_id</w:t>
             </w:r>
             <w:proofErr w:type="spellEnd"/>
           </w:p>
@@ -7992,7 +8539,15 @@
                 <w:sz w:val="24"/>
                 <w:szCs w:val="24"/>
               </w:rPr>
-              <w:t>VARCHAR(45)</w:t>
+              <w:t>INT</w:t>
+            </w:r>
+            <w:r>
+              <w:rPr>
+                <w:rFonts w:ascii="Times New Roman" w:hAnsi="Times New Roman" w:cs="Times New Roman"/>
+                <w:sz w:val="24"/>
+                <w:szCs w:val="24"/>
+              </w:rPr>
+              <w:t xml:space="preserve"> (4)</w:t>
             </w:r>
           </w:p>
         </w:tc>
@@ -8020,7 +8575,31 @@
                 <w:sz w:val="24"/>
                 <w:szCs w:val="24"/>
               </w:rPr>
-              <w:t>Обязательное поле</w:t>
+              <w:t>Вторичный ключ</w:t>
+            </w:r>
+            <w:r>
+              <w:rPr>
+                <w:rFonts w:ascii="Times New Roman" w:hAnsi="Times New Roman" w:cs="Times New Roman"/>
+                <w:sz w:val="24"/>
+                <w:szCs w:val="24"/>
+              </w:rPr>
+              <w:t xml:space="preserve"> (</w:t>
+            </w:r>
+            <w:r>
+              <w:rPr>
+                <w:rFonts w:ascii="Times New Roman" w:hAnsi="Times New Roman" w:cs="Times New Roman"/>
+                <w:sz w:val="24"/>
+                <w:szCs w:val="24"/>
+              </w:rPr>
+              <w:t>Поставщики</w:t>
+            </w:r>
+            <w:r>
+              <w:rPr>
+                <w:rFonts w:ascii="Times New Roman" w:hAnsi="Times New Roman" w:cs="Times New Roman"/>
+                <w:sz w:val="24"/>
+                <w:szCs w:val="24"/>
+              </w:rPr>
+              <w:t>)</w:t>
             </w:r>
           </w:p>
         </w:tc>
@@ -8050,7 +8629,7 @@
                 <w:sz w:val="24"/>
                 <w:szCs w:val="24"/>
               </w:rPr>
-              <w:t>Единица измерения</w:t>
+              <w:t>Производитель</w:t>
             </w:r>
           </w:p>
         </w:tc>
@@ -8072,14 +8651,16 @@
                 <w:szCs w:val="24"/>
               </w:rPr>
             </w:pPr>
-            <w:r>
-              <w:rPr>
-                <w:rFonts w:ascii="Times New Roman" w:hAnsi="Times New Roman" w:cs="Times New Roman"/>
-                <w:sz w:val="24"/>
-                <w:szCs w:val="24"/>
-              </w:rPr>
-              <w:t>unit</w:t>
-            </w:r>
+            <w:proofErr w:type="spellStart"/>
+            <w:r>
+              <w:rPr>
+                <w:rFonts w:ascii="Times New Roman" w:hAnsi="Times New Roman" w:cs="Times New Roman"/>
+                <w:sz w:val="24"/>
+                <w:szCs w:val="24"/>
+              </w:rPr>
+              <w:t>manufacturer_id</w:t>
+            </w:r>
+            <w:proofErr w:type="spellEnd"/>
           </w:p>
         </w:tc>
         <w:tc>
@@ -8106,7 +8687,15 @@
                 <w:sz w:val="24"/>
                 <w:szCs w:val="24"/>
               </w:rPr>
-              <w:t>VARCHAR(10)</w:t>
+              <w:t>INT</w:t>
+            </w:r>
+            <w:r>
+              <w:rPr>
+                <w:rFonts w:ascii="Times New Roman" w:hAnsi="Times New Roman" w:cs="Times New Roman"/>
+                <w:sz w:val="24"/>
+                <w:szCs w:val="24"/>
+              </w:rPr>
+              <w:t xml:space="preserve"> (4)</w:t>
             </w:r>
           </w:p>
         </w:tc>
@@ -8128,6 +8717,38 @@
                 <w:szCs w:val="24"/>
               </w:rPr>
             </w:pPr>
+            <w:r>
+              <w:rPr>
+                <w:rFonts w:ascii="Times New Roman" w:hAnsi="Times New Roman" w:cs="Times New Roman"/>
+                <w:sz w:val="24"/>
+                <w:szCs w:val="24"/>
+              </w:rPr>
+              <w:t>Вторичный ключ</w:t>
+            </w:r>
+            <w:r>
+              <w:rPr>
+                <w:rFonts w:ascii="Times New Roman" w:hAnsi="Times New Roman" w:cs="Times New Roman"/>
+                <w:sz w:val="24"/>
+                <w:szCs w:val="24"/>
+              </w:rPr>
+              <w:t xml:space="preserve"> (</w:t>
+            </w:r>
+            <w:r>
+              <w:rPr>
+                <w:rFonts w:ascii="Times New Roman" w:hAnsi="Times New Roman" w:cs="Times New Roman"/>
+                <w:sz w:val="24"/>
+                <w:szCs w:val="24"/>
+              </w:rPr>
+              <w:t>Производители</w:t>
+            </w:r>
+            <w:r>
+              <w:rPr>
+                <w:rFonts w:ascii="Times New Roman" w:hAnsi="Times New Roman" w:cs="Times New Roman"/>
+                <w:sz w:val="24"/>
+                <w:szCs w:val="24"/>
+              </w:rPr>
+              <w:t>)</w:t>
+            </w:r>
           </w:p>
         </w:tc>
       </w:tr>
@@ -8156,7 +8777,7 @@
                 <w:sz w:val="24"/>
                 <w:szCs w:val="24"/>
               </w:rPr>
-              <w:t>Цена товара</w:t>
+              <w:t>Категория</w:t>
             </w:r>
           </w:p>
         </w:tc>
@@ -8185,7 +8806,7 @@
                 <w:sz w:val="24"/>
                 <w:szCs w:val="24"/>
               </w:rPr>
-              <w:t>cost</w:t>
+              <w:t>product_category_id</w:t>
             </w:r>
             <w:proofErr w:type="spellEnd"/>
           </w:p>
@@ -8214,7 +8835,15 @@
                 <w:sz w:val="24"/>
                 <w:szCs w:val="24"/>
               </w:rPr>
-              <w:t>DECIMAL(10,2)</w:t>
+              <w:t>INT</w:t>
+            </w:r>
+            <w:r>
+              <w:rPr>
+                <w:rFonts w:ascii="Times New Roman" w:hAnsi="Times New Roman" w:cs="Times New Roman"/>
+                <w:sz w:val="24"/>
+                <w:szCs w:val="24"/>
+              </w:rPr>
+              <w:t xml:space="preserve"> (4)</w:t>
             </w:r>
           </w:p>
         </w:tc>
@@ -8242,7 +8871,31 @@
                 <w:sz w:val="24"/>
                 <w:szCs w:val="24"/>
               </w:rPr>
-              <w:t>Обязательное поле</w:t>
+              <w:t xml:space="preserve">Вторичный ключ </w:t>
+            </w:r>
+            <w:r>
+              <w:rPr>
+                <w:rFonts w:ascii="Times New Roman" w:hAnsi="Times New Roman" w:cs="Times New Roman"/>
+                <w:sz w:val="24"/>
+                <w:szCs w:val="24"/>
+              </w:rPr>
+              <w:t>(</w:t>
+            </w:r>
+            <w:r>
+              <w:rPr>
+                <w:rFonts w:ascii="Times New Roman" w:hAnsi="Times New Roman" w:cs="Times New Roman"/>
+                <w:sz w:val="24"/>
+                <w:szCs w:val="24"/>
+              </w:rPr>
+              <w:t>Категории</w:t>
+            </w:r>
+            <w:r>
+              <w:rPr>
+                <w:rFonts w:ascii="Times New Roman" w:hAnsi="Times New Roman" w:cs="Times New Roman"/>
+                <w:sz w:val="24"/>
+                <w:szCs w:val="24"/>
+              </w:rPr>
+              <w:t>)</w:t>
             </w:r>
           </w:p>
         </w:tc>
@@ -8272,7 +8925,7 @@
                 <w:sz w:val="24"/>
                 <w:szCs w:val="24"/>
               </w:rPr>
-              <w:t>Поставщик</w:t>
+              <w:t>Скидка</w:t>
             </w:r>
           </w:p>
         </w:tc>
@@ -8301,7 +8954,7 @@
                 <w:sz w:val="24"/>
                 <w:szCs w:val="24"/>
               </w:rPr>
-              <w:t>supplier_id</w:t>
+              <w:t>discount</w:t>
             </w:r>
             <w:proofErr w:type="spellEnd"/>
           </w:p>
@@ -8330,7 +8983,7 @@
                 <w:sz w:val="24"/>
                 <w:szCs w:val="24"/>
               </w:rPr>
-              <w:t>INT</w:t>
+              <w:t>DECIMAL(5,2)</w:t>
             </w:r>
           </w:p>
         </w:tc>
@@ -8352,32 +9005,6 @@
                 <w:szCs w:val="24"/>
               </w:rPr>
             </w:pPr>
-            <w:r>
-              <w:rPr>
-                <w:rFonts w:ascii="Times New Roman" w:hAnsi="Times New Roman" w:cs="Times New Roman"/>
-                <w:sz w:val="24"/>
-                <w:szCs w:val="24"/>
-              </w:rPr>
-              <w:t>Foreign Key (</w:t>
-            </w:r>
-            <w:proofErr w:type="spellStart"/>
-            <w:r>
-              <w:rPr>
-                <w:rFonts w:ascii="Times New Roman" w:hAnsi="Times New Roman" w:cs="Times New Roman"/>
-                <w:sz w:val="24"/>
-                <w:szCs w:val="24"/>
-              </w:rPr>
-              <w:t>suppliers</w:t>
-            </w:r>
-            <w:proofErr w:type="spellEnd"/>
-            <w:r>
-              <w:rPr>
-                <w:rFonts w:ascii="Times New Roman" w:hAnsi="Times New Roman" w:cs="Times New Roman"/>
-                <w:sz w:val="24"/>
-                <w:szCs w:val="24"/>
-              </w:rPr>
-              <w:t>)</w:t>
-            </w:r>
           </w:p>
         </w:tc>
       </w:tr>
@@ -8406,7 +9033,7 @@
                 <w:sz w:val="24"/>
                 <w:szCs w:val="24"/>
               </w:rPr>
-              <w:t>Производитель</w:t>
+              <w:t>Кол-во на складе</w:t>
             </w:r>
           </w:p>
         </w:tc>
@@ -8435,7 +9062,7 @@
                 <w:sz w:val="24"/>
                 <w:szCs w:val="24"/>
               </w:rPr>
-              <w:t>manufacturer_id</w:t>
+              <w:t>amount_in_storage</w:t>
             </w:r>
             <w:proofErr w:type="spellEnd"/>
           </w:p>
@@ -8466,381 +9093,13 @@
               </w:rPr>
               <w:t>INT</w:t>
             </w:r>
-          </w:p>
-        </w:tc>
-        <w:tc>
-          <w:tcPr>
-            <w:tcW w:w="0" w:type="auto"/>
-            <w:hideMark/>
-          </w:tcPr>
-          <w:p>
-            <w:pPr>
-              <w:tabs>
-                <w:tab w:val="left" w:pos="851"/>
-              </w:tabs>
-              <w:spacing w:line="360" w:lineRule="auto"/>
-              <w:jc w:val="center"/>
-              <w:rPr>
-                <w:rFonts w:ascii="Times New Roman" w:hAnsi="Times New Roman" w:cs="Times New Roman"/>
-                <w:sz w:val="24"/>
-                <w:szCs w:val="24"/>
-              </w:rPr>
-            </w:pPr>
-            <w:r>
-              <w:rPr>
-                <w:rFonts w:ascii="Times New Roman" w:hAnsi="Times New Roman" w:cs="Times New Roman"/>
-                <w:sz w:val="24"/>
-                <w:szCs w:val="24"/>
-              </w:rPr>
-              <w:t>Foreign Key (</w:t>
-            </w:r>
-            <w:proofErr w:type="spellStart"/>
-            <w:r>
-              <w:rPr>
-                <w:rFonts w:ascii="Times New Roman" w:hAnsi="Times New Roman" w:cs="Times New Roman"/>
-                <w:sz w:val="24"/>
-                <w:szCs w:val="24"/>
-              </w:rPr>
-              <w:t>manufacturers</w:t>
-            </w:r>
-            <w:proofErr w:type="spellEnd"/>
-            <w:r>
-              <w:rPr>
-                <w:rFonts w:ascii="Times New Roman" w:hAnsi="Times New Roman" w:cs="Times New Roman"/>
-                <w:sz w:val="24"/>
-                <w:szCs w:val="24"/>
-              </w:rPr>
-              <w:t>)</w:t>
-            </w:r>
-          </w:p>
-        </w:tc>
-      </w:tr>
-      <w:tr>
-        <w:tc>
-          <w:tcPr>
-            <w:tcW w:w="0" w:type="auto"/>
-            <w:hideMark/>
-          </w:tcPr>
-          <w:p>
-            <w:pPr>
-              <w:tabs>
-                <w:tab w:val="left" w:pos="851"/>
-              </w:tabs>
-              <w:spacing w:line="360" w:lineRule="auto"/>
-              <w:jc w:val="center"/>
-              <w:rPr>
-                <w:rFonts w:ascii="Times New Roman" w:hAnsi="Times New Roman" w:cs="Times New Roman"/>
-                <w:sz w:val="24"/>
-                <w:szCs w:val="24"/>
-              </w:rPr>
-            </w:pPr>
-            <w:r>
-              <w:rPr>
-                <w:rFonts w:ascii="Times New Roman" w:hAnsi="Times New Roman" w:cs="Times New Roman"/>
-                <w:sz w:val="24"/>
-                <w:szCs w:val="24"/>
-              </w:rPr>
-              <w:t>Категория</w:t>
-            </w:r>
-          </w:p>
-        </w:tc>
-        <w:tc>
-          <w:tcPr>
-            <w:tcW w:w="0" w:type="auto"/>
-            <w:hideMark/>
-          </w:tcPr>
-          <w:p>
-            <w:pPr>
-              <w:tabs>
-                <w:tab w:val="left" w:pos="851"/>
-              </w:tabs>
-              <w:spacing w:line="360" w:lineRule="auto"/>
-              <w:jc w:val="center"/>
-              <w:rPr>
-                <w:rFonts w:ascii="Times New Roman" w:hAnsi="Times New Roman" w:cs="Times New Roman"/>
-                <w:sz w:val="24"/>
-                <w:szCs w:val="24"/>
-              </w:rPr>
-            </w:pPr>
-            <w:proofErr w:type="spellStart"/>
-            <w:r>
-              <w:rPr>
-                <w:rFonts w:ascii="Times New Roman" w:hAnsi="Times New Roman" w:cs="Times New Roman"/>
-                <w:sz w:val="24"/>
-                <w:szCs w:val="24"/>
-              </w:rPr>
-              <w:t>product_category_id</w:t>
-            </w:r>
-            <w:proofErr w:type="spellEnd"/>
-          </w:p>
-        </w:tc>
-        <w:tc>
-          <w:tcPr>
-            <w:tcW w:w="0" w:type="auto"/>
-            <w:hideMark/>
-          </w:tcPr>
-          <w:p>
-            <w:pPr>
-              <w:tabs>
-                <w:tab w:val="left" w:pos="851"/>
-              </w:tabs>
-              <w:spacing w:line="360" w:lineRule="auto"/>
-              <w:jc w:val="center"/>
-              <w:rPr>
-                <w:rFonts w:ascii="Times New Roman" w:hAnsi="Times New Roman" w:cs="Times New Roman"/>
-                <w:sz w:val="24"/>
-                <w:szCs w:val="24"/>
-              </w:rPr>
-            </w:pPr>
-            <w:r>
-              <w:rPr>
-                <w:rFonts w:ascii="Times New Roman" w:hAnsi="Times New Roman" w:cs="Times New Roman"/>
-                <w:sz w:val="24"/>
-                <w:szCs w:val="24"/>
-              </w:rPr>
-              <w:t>INT</w:t>
-            </w:r>
-          </w:p>
-        </w:tc>
-        <w:tc>
-          <w:tcPr>
-            <w:tcW w:w="0" w:type="auto"/>
-            <w:hideMark/>
-          </w:tcPr>
-          <w:p>
-            <w:pPr>
-              <w:tabs>
-                <w:tab w:val="left" w:pos="851"/>
-              </w:tabs>
-              <w:spacing w:line="360" w:lineRule="auto"/>
-              <w:jc w:val="center"/>
-              <w:rPr>
-                <w:rFonts w:ascii="Times New Roman" w:hAnsi="Times New Roman" w:cs="Times New Roman"/>
-                <w:sz w:val="24"/>
-                <w:szCs w:val="24"/>
-              </w:rPr>
-            </w:pPr>
-            <w:r>
-              <w:rPr>
-                <w:rFonts w:ascii="Times New Roman" w:hAnsi="Times New Roman" w:cs="Times New Roman"/>
-                <w:sz w:val="24"/>
-                <w:szCs w:val="24"/>
-              </w:rPr>
-              <w:t>Foreign Key (</w:t>
-            </w:r>
-            <w:proofErr w:type="spellStart"/>
-            <w:r>
-              <w:rPr>
-                <w:rFonts w:ascii="Times New Roman" w:hAnsi="Times New Roman" w:cs="Times New Roman"/>
-                <w:sz w:val="24"/>
-                <w:szCs w:val="24"/>
-              </w:rPr>
-              <w:t>product_categories</w:t>
-            </w:r>
-            <w:proofErr w:type="spellEnd"/>
-            <w:r>
-              <w:rPr>
-                <w:rFonts w:ascii="Times New Roman" w:hAnsi="Times New Roman" w:cs="Times New Roman"/>
-                <w:sz w:val="24"/>
-                <w:szCs w:val="24"/>
-              </w:rPr>
-              <w:t>)</w:t>
-            </w:r>
-          </w:p>
-        </w:tc>
-      </w:tr>
-      <w:tr>
-        <w:tc>
-          <w:tcPr>
-            <w:tcW w:w="0" w:type="auto"/>
-            <w:hideMark/>
-          </w:tcPr>
-          <w:p>
-            <w:pPr>
-              <w:tabs>
-                <w:tab w:val="left" w:pos="851"/>
-              </w:tabs>
-              <w:spacing w:line="360" w:lineRule="auto"/>
-              <w:jc w:val="center"/>
-              <w:rPr>
-                <w:rFonts w:ascii="Times New Roman" w:hAnsi="Times New Roman" w:cs="Times New Roman"/>
-                <w:sz w:val="24"/>
-                <w:szCs w:val="24"/>
-              </w:rPr>
-            </w:pPr>
-            <w:r>
-              <w:rPr>
-                <w:rFonts w:ascii="Times New Roman" w:hAnsi="Times New Roman" w:cs="Times New Roman"/>
-                <w:sz w:val="24"/>
-                <w:szCs w:val="24"/>
-              </w:rPr>
-              <w:t>Скидка</w:t>
-            </w:r>
-          </w:p>
-        </w:tc>
-        <w:tc>
-          <w:tcPr>
-            <w:tcW w:w="0" w:type="auto"/>
-            <w:hideMark/>
-          </w:tcPr>
-          <w:p>
-            <w:pPr>
-              <w:tabs>
-                <w:tab w:val="left" w:pos="851"/>
-              </w:tabs>
-              <w:spacing w:line="360" w:lineRule="auto"/>
-              <w:jc w:val="center"/>
-              <w:rPr>
-                <w:rFonts w:ascii="Times New Roman" w:hAnsi="Times New Roman" w:cs="Times New Roman"/>
-                <w:sz w:val="24"/>
-                <w:szCs w:val="24"/>
-              </w:rPr>
-            </w:pPr>
-            <w:proofErr w:type="spellStart"/>
-            <w:r>
-              <w:rPr>
-                <w:rFonts w:ascii="Times New Roman" w:hAnsi="Times New Roman" w:cs="Times New Roman"/>
-                <w:sz w:val="24"/>
-                <w:szCs w:val="24"/>
-              </w:rPr>
-              <w:t>discount</w:t>
-            </w:r>
-            <w:proofErr w:type="spellEnd"/>
-          </w:p>
-        </w:tc>
-        <w:tc>
-          <w:tcPr>
-            <w:tcW w:w="0" w:type="auto"/>
-            <w:hideMark/>
-          </w:tcPr>
-          <w:p>
-            <w:pPr>
-              <w:tabs>
-                <w:tab w:val="left" w:pos="851"/>
-              </w:tabs>
-              <w:spacing w:line="360" w:lineRule="auto"/>
-              <w:jc w:val="center"/>
-              <w:rPr>
-                <w:rFonts w:ascii="Times New Roman" w:hAnsi="Times New Roman" w:cs="Times New Roman"/>
-                <w:sz w:val="24"/>
-                <w:szCs w:val="24"/>
-              </w:rPr>
-            </w:pPr>
-            <w:r>
-              <w:rPr>
-                <w:rFonts w:ascii="Times New Roman" w:hAnsi="Times New Roman" w:cs="Times New Roman"/>
-                <w:sz w:val="24"/>
-                <w:szCs w:val="24"/>
-              </w:rPr>
-              <w:t>DECIMAL(5,2)</w:t>
-            </w:r>
-          </w:p>
-        </w:tc>
-        <w:tc>
-          <w:tcPr>
-            <w:tcW w:w="0" w:type="auto"/>
-            <w:hideMark/>
-          </w:tcPr>
-          <w:p>
-            <w:pPr>
-              <w:tabs>
-                <w:tab w:val="left" w:pos="851"/>
-              </w:tabs>
-              <w:spacing w:line="360" w:lineRule="auto"/>
-              <w:jc w:val="center"/>
-              <w:rPr>
-                <w:rFonts w:ascii="Times New Roman" w:hAnsi="Times New Roman" w:cs="Times New Roman"/>
-                <w:sz w:val="24"/>
-                <w:szCs w:val="24"/>
-              </w:rPr>
-            </w:pPr>
-          </w:p>
-        </w:tc>
-      </w:tr>
-      <w:tr>
-        <w:tc>
-          <w:tcPr>
-            <w:tcW w:w="0" w:type="auto"/>
-            <w:hideMark/>
-          </w:tcPr>
-          <w:p>
-            <w:pPr>
-              <w:tabs>
-                <w:tab w:val="left" w:pos="851"/>
-              </w:tabs>
-              <w:spacing w:line="360" w:lineRule="auto"/>
-              <w:jc w:val="center"/>
-              <w:rPr>
-                <w:rFonts w:ascii="Times New Roman" w:hAnsi="Times New Roman" w:cs="Times New Roman"/>
-                <w:sz w:val="24"/>
-                <w:szCs w:val="24"/>
-              </w:rPr>
-            </w:pPr>
-            <w:r>
-              <w:rPr>
-                <w:rFonts w:ascii="Times New Roman" w:hAnsi="Times New Roman" w:cs="Times New Roman"/>
-                <w:sz w:val="24"/>
-                <w:szCs w:val="24"/>
-              </w:rPr>
-              <w:t>Кол-во на складе</w:t>
-            </w:r>
-          </w:p>
-        </w:tc>
-        <w:tc>
-          <w:tcPr>
-            <w:tcW w:w="0" w:type="auto"/>
-            <w:hideMark/>
-          </w:tcPr>
-          <w:p>
-            <w:pPr>
-              <w:tabs>
-                <w:tab w:val="left" w:pos="851"/>
-              </w:tabs>
-              <w:spacing w:line="360" w:lineRule="auto"/>
-              <w:jc w:val="center"/>
-              <w:rPr>
-                <w:rFonts w:ascii="Times New Roman" w:hAnsi="Times New Roman" w:cs="Times New Roman"/>
-                <w:sz w:val="24"/>
-                <w:szCs w:val="24"/>
-              </w:rPr>
-            </w:pPr>
-            <w:proofErr w:type="spellStart"/>
-            <w:r>
-              <w:rPr>
-                <w:rFonts w:ascii="Times New Roman" w:hAnsi="Times New Roman" w:cs="Times New Roman"/>
-                <w:sz w:val="24"/>
-                <w:szCs w:val="24"/>
-              </w:rPr>
-              <w:t>amount_in_storage</w:t>
-            </w:r>
-            <w:proofErr w:type="spellEnd"/>
-          </w:p>
-        </w:tc>
-        <w:tc>
-          <w:tcPr>
-            <w:tcW w:w="0" w:type="auto"/>
-            <w:hideMark/>
-          </w:tcPr>
-          <w:p>
-            <w:pPr>
-              <w:tabs>
-                <w:tab w:val="left" w:pos="851"/>
-              </w:tabs>
-              <w:spacing w:line="360" w:lineRule="auto"/>
-              <w:jc w:val="center"/>
-              <w:rPr>
-                <w:rFonts w:ascii="Times New Roman" w:hAnsi="Times New Roman" w:cs="Times New Roman"/>
-                <w:sz w:val="24"/>
-                <w:szCs w:val="24"/>
-              </w:rPr>
-            </w:pPr>
-            <w:r>
-              <w:rPr>
-                <w:rFonts w:ascii="Times New Roman" w:hAnsi="Times New Roman" w:cs="Times New Roman"/>
-                <w:sz w:val="24"/>
-                <w:szCs w:val="24"/>
-              </w:rPr>
-              <w:t>INT</w:t>
+            <w:r>
+              <w:rPr>
+                <w:rFonts w:ascii="Times New Roman" w:hAnsi="Times New Roman" w:cs="Times New Roman"/>
+                <w:sz w:val="24"/>
+                <w:szCs w:val="24"/>
+              </w:rPr>
+              <w:t xml:space="preserve"> (4)</w:t>
             </w:r>
           </w:p>
         </w:tc>
@@ -9130,10 +9389,10 @@
         <w:tblLook w:val="04A0" w:firstRow="1" w:lastRow="0" w:firstColumn="1" w:lastColumn="0" w:noHBand="0" w:noVBand="1"/>
       </w:tblPr>
       <w:tblGrid>
-        <w:gridCol w:w="2542"/>
+        <w:gridCol w:w="2741"/>
         <w:gridCol w:w="1910"/>
         <w:gridCol w:w="1790"/>
-        <w:gridCol w:w="3386"/>
+        <w:gridCol w:w="3187"/>
       </w:tblGrid>
       <w:tr>
         <w:tc>
@@ -9334,6 +9593,14 @@
               </w:rPr>
               <w:t>INT</w:t>
             </w:r>
+            <w:r>
+              <w:rPr>
+                <w:rFonts w:ascii="Times New Roman" w:hAnsi="Times New Roman" w:cs="Times New Roman"/>
+                <w:sz w:val="24"/>
+                <w:szCs w:val="24"/>
+              </w:rPr>
+              <w:t xml:space="preserve"> (4)</w:t>
+            </w:r>
           </w:p>
         </w:tc>
         <w:tc>
@@ -9360,7 +9627,7 @@
                 <w:sz w:val="24"/>
                 <w:szCs w:val="24"/>
               </w:rPr>
-              <w:t>PRIMARY KEY, AUTO_INCREMENT</w:t>
+              <w:t>Суррогатный первичный ключ</w:t>
             </w:r>
           </w:p>
         </w:tc>
@@ -9476,18 +9743,24 @@
                 <w:sz w:val="24"/>
                 <w:szCs w:val="24"/>
               </w:rPr>
-              <w:t>Foreign Key (</w:t>
-            </w:r>
-            <w:proofErr w:type="spellStart"/>
-            <w:r>
-              <w:rPr>
-                <w:rFonts w:ascii="Times New Roman" w:hAnsi="Times New Roman" w:cs="Times New Roman"/>
-                <w:sz w:val="24"/>
-                <w:szCs w:val="24"/>
-              </w:rPr>
-              <w:t>products</w:t>
-            </w:r>
-            <w:proofErr w:type="spellEnd"/>
+              <w:t xml:space="preserve">Вторичный ключ </w:t>
+            </w:r>
+            <w:r>
+              <w:rPr>
+                <w:rFonts w:ascii="Times New Roman" w:hAnsi="Times New Roman" w:cs="Times New Roman"/>
+                <w:sz w:val="24"/>
+                <w:szCs w:val="24"/>
+              </w:rPr>
+              <w:t>(</w:t>
+            </w:r>
+            <w:r>
+              <w:rPr>
+                <w:rFonts w:ascii="Times New Roman" w:hAnsi="Times New Roman" w:cs="Times New Roman"/>
+                <w:sz w:val="24"/>
+                <w:szCs w:val="24"/>
+              </w:rPr>
+              <w:t>Продукты</w:t>
+            </w:r>
             <w:r>
               <w:rPr>
                 <w:rFonts w:ascii="Times New Roman" w:hAnsi="Times New Roman" w:cs="Times New Roman"/>
@@ -9584,6 +9857,14 @@
               </w:rPr>
               <w:t>INT</w:t>
             </w:r>
+            <w:r>
+              <w:rPr>
+                <w:rFonts w:ascii="Times New Roman" w:hAnsi="Times New Roman" w:cs="Times New Roman"/>
+                <w:sz w:val="24"/>
+                <w:szCs w:val="24"/>
+              </w:rPr>
+              <w:t xml:space="preserve"> (4)</w:t>
+            </w:r>
           </w:p>
         </w:tc>
         <w:tc>
@@ -9808,6 +10089,14 @@
               </w:rPr>
               <w:t>DATE</w:t>
             </w:r>
+            <w:r>
+              <w:rPr>
+                <w:rFonts w:ascii="Times New Roman" w:hAnsi="Times New Roman" w:cs="Times New Roman"/>
+                <w:sz w:val="24"/>
+                <w:szCs w:val="24"/>
+              </w:rPr>
+              <w:t xml:space="preserve"> (3)</w:t>
+            </w:r>
           </w:p>
         </w:tc>
         <w:tc>
@@ -9916,6 +10205,14 @@
               </w:rPr>
               <w:t>INT</w:t>
             </w:r>
+            <w:r>
+              <w:rPr>
+                <w:rFonts w:ascii="Times New Roman" w:hAnsi="Times New Roman" w:cs="Times New Roman"/>
+                <w:sz w:val="24"/>
+                <w:szCs w:val="24"/>
+              </w:rPr>
+              <w:t xml:space="preserve"> (4)</w:t>
+            </w:r>
           </w:p>
         </w:tc>
         <w:tc>
@@ -9942,11 +10239,26 @@
                 <w:rFonts w:ascii="Times New Roman" w:hAnsi="Times New Roman" w:cs="Times New Roman"/>
                 <w:sz w:val="24"/>
                 <w:szCs w:val="24"/>
+              </w:rPr>
+              <w:t>Вторичный</w:t>
+            </w:r>
+            <w:r>
+              <w:rPr>
+                <w:rFonts w:ascii="Times New Roman" w:hAnsi="Times New Roman" w:cs="Times New Roman"/>
+                <w:sz w:val="24"/>
+                <w:szCs w:val="24"/>
                 <w:lang w:val="en-US"/>
               </w:rPr>
-              <w:t>Foreign Key (</w:t>
-            </w:r>
-            <w:proofErr w:type="spellStart"/>
+              <w:t xml:space="preserve"> </w:t>
+            </w:r>
+            <w:r>
+              <w:rPr>
+                <w:rFonts w:ascii="Times New Roman" w:hAnsi="Times New Roman" w:cs="Times New Roman"/>
+                <w:sz w:val="24"/>
+                <w:szCs w:val="24"/>
+              </w:rPr>
+              <w:t>ключ</w:t>
+            </w:r>
             <w:r>
               <w:rPr>
                 <w:rFonts w:ascii="Times New Roman" w:hAnsi="Times New Roman" w:cs="Times New Roman"/>
@@ -9954,9 +10266,16 @@
                 <w:szCs w:val="24"/>
                 <w:lang w:val="en-US"/>
               </w:rPr>
-              <w:t>pick_up_points</w:t>
-            </w:r>
-            <w:proofErr w:type="spellEnd"/>
+              <w:t xml:space="preserve"> (</w:t>
+            </w:r>
+            <w:r>
+              <w:rPr>
+                <w:rFonts w:ascii="Times New Roman" w:hAnsi="Times New Roman" w:cs="Times New Roman"/>
+                <w:sz w:val="24"/>
+                <w:szCs w:val="24"/>
+              </w:rPr>
+              <w:t>пункты выдачи</w:t>
+            </w:r>
             <w:r>
               <w:rPr>
                 <w:rFonts w:ascii="Times New Roman" w:hAnsi="Times New Roman" w:cs="Times New Roman"/>
@@ -10054,6 +10373,14 @@
               </w:rPr>
               <w:t>INT</w:t>
             </w:r>
+            <w:r>
+              <w:rPr>
+                <w:rFonts w:ascii="Times New Roman" w:hAnsi="Times New Roman" w:cs="Times New Roman"/>
+                <w:sz w:val="24"/>
+                <w:szCs w:val="24"/>
+              </w:rPr>
+              <w:t xml:space="preserve"> (4)</w:t>
+            </w:r>
           </w:p>
         </w:tc>
         <w:tc>
@@ -10080,18 +10407,24 @@
                 <w:sz w:val="24"/>
                 <w:szCs w:val="24"/>
               </w:rPr>
-              <w:t>Foreign Key (</w:t>
-            </w:r>
-            <w:proofErr w:type="spellStart"/>
-            <w:r>
-              <w:rPr>
-                <w:rFonts w:ascii="Times New Roman" w:hAnsi="Times New Roman" w:cs="Times New Roman"/>
-                <w:sz w:val="24"/>
-                <w:szCs w:val="24"/>
-              </w:rPr>
-              <w:t>users</w:t>
-            </w:r>
-            <w:proofErr w:type="spellEnd"/>
+              <w:t xml:space="preserve">Вторичный ключ </w:t>
+            </w:r>
+            <w:r>
+              <w:rPr>
+                <w:rFonts w:ascii="Times New Roman" w:hAnsi="Times New Roman" w:cs="Times New Roman"/>
+                <w:sz w:val="24"/>
+                <w:szCs w:val="24"/>
+              </w:rPr>
+              <w:t>(</w:t>
+            </w:r>
+            <w:r>
+              <w:rPr>
+                <w:rFonts w:ascii="Times New Roman" w:hAnsi="Times New Roman" w:cs="Times New Roman"/>
+                <w:sz w:val="24"/>
+                <w:szCs w:val="24"/>
+              </w:rPr>
+              <w:t>Пользователи</w:t>
+            </w:r>
             <w:r>
               <w:rPr>
                 <w:rFonts w:ascii="Times New Roman" w:hAnsi="Times New Roman" w:cs="Times New Roman"/>
@@ -15419,7 +15752,6 @@
                 <w:rFonts w:ascii="Times New Roman" w:hAnsi="Times New Roman" w:cs="Times New Roman"/>
                 <w:sz w:val="24"/>
                 <w:szCs w:val="28"/>
-                <w:lang w:val="en-US"/>
               </w:rPr>
             </w:pPr>
           </w:p>
@@ -21297,6 +21629,7 @@
       <w:r>
         <w:rPr>
           <w:rFonts w:ascii="Times New Roman" w:hAnsi="Times New Roman" w:cs="Times New Roman"/>
+          <w:noProof/>
           <w:sz w:val="28"/>
           <w:szCs w:val="28"/>
         </w:rPr>
@@ -21395,6 +21728,7 @@
       <w:r>
         <w:rPr>
           <w:rFonts w:ascii="Times New Roman" w:hAnsi="Times New Roman" w:cs="Times New Roman"/>
+          <w:noProof/>
           <w:sz w:val="28"/>
           <w:szCs w:val="28"/>
         </w:rPr>
@@ -22203,6 +22537,7 @@
       <w:r>
         <w:rPr>
           <w:rFonts w:ascii="Times New Roman" w:hAnsi="Times New Roman" w:cs="Times New Roman"/>
+          <w:noProof/>
           <w:sz w:val="28"/>
           <w:szCs w:val="28"/>
         </w:rPr>
@@ -22266,6 +22601,7 @@
       <w:r>
         <w:rPr>
           <w:rFonts w:ascii="Times New Roman" w:hAnsi="Times New Roman" w:cs="Times New Roman"/>
+          <w:noProof/>
           <w:sz w:val="28"/>
           <w:szCs w:val="28"/>
         </w:rPr>
@@ -23045,6 +23381,7 @@
       <w:r>
         <w:rPr>
           <w:rFonts w:ascii="Times New Roman" w:hAnsi="Times New Roman" w:cs="Times New Roman"/>
+          <w:noProof/>
           <w:sz w:val="28"/>
           <w:szCs w:val="28"/>
         </w:rPr>
@@ -23107,6 +23444,7 @@
       <w:r>
         <w:rPr>
           <w:rFonts w:ascii="Times New Roman" w:hAnsi="Times New Roman" w:cs="Times New Roman"/>
+          <w:noProof/>
           <w:sz w:val="28"/>
           <w:szCs w:val="28"/>
         </w:rPr>
@@ -23885,6 +24223,7 @@
       <w:r>
         <w:rPr>
           <w:rFonts w:ascii="Times New Roman" w:hAnsi="Times New Roman" w:cs="Times New Roman"/>
+          <w:noProof/>
           <w:sz w:val="28"/>
           <w:szCs w:val="28"/>
         </w:rPr>
@@ -23964,6 +24303,7 @@
       <w:r>
         <w:rPr>
           <w:rFonts w:ascii="Times New Roman" w:hAnsi="Times New Roman" w:cs="Times New Roman"/>
+          <w:noProof/>
           <w:sz w:val="28"/>
           <w:szCs w:val="28"/>
         </w:rPr>
@@ -24520,47 +24860,7 @@
                 <w:sz w:val="24"/>
                 <w:szCs w:val="24"/>
               </w:rPr>
-              <w:t xml:space="preserve">проверить систему на корректность выхода из </w:t>
-            </w:r>
-            <w:r>
-              <w:rPr>
-                <w:rFonts w:ascii="Times New Roman" w:hAnsi="Times New Roman" w:cs="Times New Roman"/>
-                <w:sz w:val="24"/>
-                <w:szCs w:val="24"/>
-              </w:rPr>
-              <w:t xml:space="preserve">окна </w:t>
-            </w:r>
-            <w:r>
-              <w:rPr>
-                <w:rFonts w:ascii="Times New Roman" w:hAnsi="Times New Roman" w:cs="Times New Roman"/>
-                <w:sz w:val="24"/>
-                <w:szCs w:val="24"/>
-              </w:rPr>
-              <w:t xml:space="preserve">заказов в </w:t>
-            </w:r>
-            <w:r>
-              <w:rPr>
-                <w:rFonts w:ascii="Times New Roman" w:hAnsi="Times New Roman" w:cs="Times New Roman"/>
-                <w:sz w:val="24"/>
-                <w:szCs w:val="24"/>
-              </w:rPr>
-              <w:t xml:space="preserve">окно </w:t>
-            </w:r>
-            <w:r>
-              <w:rPr>
-                <w:rFonts w:ascii="Times New Roman" w:hAnsi="Times New Roman" w:cs="Times New Roman"/>
-                <w:sz w:val="24"/>
-                <w:szCs w:val="24"/>
-              </w:rPr>
-              <w:t>каталог</w:t>
-            </w:r>
-            <w:r>
-              <w:rPr>
-                <w:rFonts w:ascii="Times New Roman" w:hAnsi="Times New Roman" w:cs="Times New Roman"/>
-                <w:sz w:val="24"/>
-                <w:szCs w:val="24"/>
-              </w:rPr>
-              <w:t>а</w:t>
+              <w:t>проверить систему на корректность выхода из окна заказов в окно каталога</w:t>
             </w:r>
           </w:p>
         </w:tc>
@@ -24961,6 +25261,7 @@
       <w:r>
         <w:rPr>
           <w:rFonts w:ascii="Times New Roman" w:hAnsi="Times New Roman" w:cs="Times New Roman"/>
+          <w:noProof/>
           <w:sz w:val="28"/>
           <w:szCs w:val="28"/>
         </w:rPr>
@@ -25031,6 +25332,7 @@
       <w:r>
         <w:rPr>
           <w:rFonts w:ascii="Times New Roman" w:hAnsi="Times New Roman" w:cs="Times New Roman"/>
+          <w:noProof/>
           <w:sz w:val="28"/>
           <w:szCs w:val="28"/>
         </w:rPr>
@@ -25209,6 +25511,7 @@
       <w:r>
         <w:rPr>
           <w:rFonts w:ascii="Times New Roman" w:hAnsi="Times New Roman" w:cs="Times New Roman"/>
+          <w:noProof/>
           <w:sz w:val="28"/>
           <w:szCs w:val="28"/>
         </w:rPr>
@@ -25356,6 +25659,7 @@
       <w:r>
         <w:rPr>
           <w:rFonts w:ascii="Times New Roman" w:hAnsi="Times New Roman" w:cs="Times New Roman"/>
+          <w:noProof/>
           <w:sz w:val="28"/>
           <w:szCs w:val="28"/>
         </w:rPr>
@@ -25418,6 +25722,7 @@
       <w:r>
         <w:rPr>
           <w:rFonts w:ascii="Times New Roman" w:hAnsi="Times New Roman" w:cs="Times New Roman"/>
+          <w:noProof/>
           <w:sz w:val="28"/>
           <w:szCs w:val="28"/>
         </w:rPr>
@@ -25501,6 +25806,7 @@
       <w:r>
         <w:rPr>
           <w:rFonts w:ascii="Times New Roman" w:hAnsi="Times New Roman" w:cs="Times New Roman"/>
+          <w:noProof/>
           <w:sz w:val="28"/>
           <w:szCs w:val="28"/>
         </w:rPr>
@@ -25615,6 +25921,7 @@
       <w:r>
         <w:rPr>
           <w:rFonts w:ascii="Times New Roman" w:hAnsi="Times New Roman" w:cs="Times New Roman"/>
+          <w:noProof/>
           <w:sz w:val="28"/>
           <w:szCs w:val="28"/>
         </w:rPr>
@@ -25718,6 +26025,7 @@
       <w:r>
         <w:rPr>
           <w:rFonts w:ascii="Times New Roman" w:hAnsi="Times New Roman" w:cs="Times New Roman"/>
+          <w:noProof/>
           <w:sz w:val="28"/>
           <w:szCs w:val="28"/>
         </w:rPr>
@@ -25821,6 +26129,7 @@
       <w:r>
         <w:rPr>
           <w:rFonts w:ascii="Times New Roman" w:hAnsi="Times New Roman" w:cs="Times New Roman"/>
+          <w:noProof/>
           <w:sz w:val="28"/>
           <w:szCs w:val="28"/>
         </w:rPr>
@@ -25950,6 +26259,7 @@
       <w:r>
         <w:rPr>
           <w:rFonts w:ascii="Times New Roman" w:hAnsi="Times New Roman" w:cs="Times New Roman"/>
+          <w:noProof/>
           <w:sz w:val="28"/>
           <w:szCs w:val="28"/>
         </w:rPr>
@@ -26052,6 +26362,7 @@
       <w:r>
         <w:rPr>
           <w:rFonts w:ascii="Times New Roman" w:hAnsi="Times New Roman" w:cs="Times New Roman"/>
+          <w:noProof/>
           <w:sz w:val="28"/>
           <w:szCs w:val="28"/>
         </w:rPr>
@@ -26155,6 +26466,7 @@
       <w:r>
         <w:rPr>
           <w:rFonts w:ascii="Times New Roman" w:hAnsi="Times New Roman" w:cs="Times New Roman"/>
+          <w:noProof/>
           <w:sz w:val="28"/>
           <w:szCs w:val="28"/>
         </w:rPr>
@@ -26269,6 +26581,7 @@
       <w:r>
         <w:rPr>
           <w:rFonts w:ascii="Times New Roman" w:hAnsi="Times New Roman" w:cs="Times New Roman"/>
+          <w:noProof/>
           <w:sz w:val="28"/>
           <w:szCs w:val="28"/>
         </w:rPr>
@@ -26331,6 +26644,7 @@
       <w:r>
         <w:rPr>
           <w:rFonts w:ascii="Times New Roman" w:hAnsi="Times New Roman" w:cs="Times New Roman"/>
+          <w:noProof/>
           <w:sz w:val="28"/>
           <w:szCs w:val="28"/>
         </w:rPr>
@@ -26452,6 +26766,7 @@
       <w:r>
         <w:rPr>
           <w:rFonts w:ascii="Times New Roman" w:hAnsi="Times New Roman" w:cs="Times New Roman"/>
+          <w:noProof/>
           <w:sz w:val="28"/>
           <w:szCs w:val="28"/>
         </w:rPr>
@@ -26527,6 +26842,7 @@
       <w:r>
         <w:rPr>
           <w:rFonts w:ascii="Times New Roman" w:hAnsi="Times New Roman" w:cs="Times New Roman"/>
+          <w:noProof/>
           <w:sz w:val="28"/>
           <w:szCs w:val="28"/>
         </w:rPr>
@@ -26694,6 +27010,7 @@
       <w:r>
         <w:rPr>
           <w:rFonts w:ascii="Times New Roman" w:hAnsi="Times New Roman" w:cs="Times New Roman"/>
+          <w:noProof/>
           <w:sz w:val="28"/>
           <w:szCs w:val="28"/>
         </w:rPr>
@@ -26756,6 +27073,7 @@
       <w:r>
         <w:rPr>
           <w:rFonts w:ascii="Times New Roman" w:hAnsi="Times New Roman" w:cs="Times New Roman"/>
+          <w:noProof/>
           <w:sz w:val="28"/>
           <w:szCs w:val="28"/>
         </w:rPr>
@@ -26871,6 +27189,7 @@
       <w:r>
         <w:rPr>
           <w:rFonts w:ascii="Times New Roman" w:hAnsi="Times New Roman" w:cs="Times New Roman"/>
+          <w:noProof/>
           <w:sz w:val="28"/>
           <w:szCs w:val="28"/>
         </w:rPr>
@@ -26946,6 +27265,7 @@
       <w:r>
         <w:rPr>
           <w:rFonts w:ascii="Times New Roman" w:hAnsi="Times New Roman" w:cs="Times New Roman"/>
+          <w:noProof/>
           <w:sz w:val="28"/>
           <w:szCs w:val="28"/>
         </w:rPr>
@@ -27061,6 +27381,7 @@
       <w:r>
         <w:rPr>
           <w:rFonts w:ascii="Times New Roman" w:hAnsi="Times New Roman" w:cs="Times New Roman"/>
+          <w:noProof/>
           <w:sz w:val="28"/>
           <w:szCs w:val="28"/>
         </w:rPr>
@@ -27135,6 +27456,7 @@
       <w:r>
         <w:rPr>
           <w:rFonts w:ascii="Times New Roman" w:hAnsi="Times New Roman" w:cs="Times New Roman"/>
+          <w:noProof/>
           <w:sz w:val="28"/>
           <w:szCs w:val="28"/>
         </w:rPr>
@@ -27264,6 +27586,7 @@
       <w:r>
         <w:rPr>
           <w:rFonts w:ascii="Times New Roman" w:hAnsi="Times New Roman" w:cs="Times New Roman"/>
+          <w:noProof/>
           <w:sz w:val="28"/>
           <w:szCs w:val="28"/>
         </w:rPr>
@@ -27396,6 +27719,7 @@
       <w:r>
         <w:rPr>
           <w:rFonts w:ascii="Times New Roman" w:hAnsi="Times New Roman" w:cs="Times New Roman"/>
+          <w:noProof/>
           <w:sz w:val="28"/>
           <w:szCs w:val="28"/>
         </w:rPr>
@@ -27470,6 +27794,7 @@
       <w:r>
         <w:rPr>
           <w:rFonts w:ascii="Times New Roman" w:hAnsi="Times New Roman" w:cs="Times New Roman"/>
+          <w:noProof/>
           <w:sz w:val="28"/>
           <w:szCs w:val="28"/>
         </w:rPr>
@@ -27585,6 +27910,7 @@
       <w:r>
         <w:rPr>
           <w:rFonts w:ascii="Times New Roman" w:hAnsi="Times New Roman" w:cs="Times New Roman"/>
+          <w:noProof/>
           <w:sz w:val="28"/>
           <w:szCs w:val="28"/>
         </w:rPr>
@@ -27672,6 +27998,7 @@
       <w:r>
         <w:rPr>
           <w:rFonts w:ascii="Times New Roman" w:hAnsi="Times New Roman" w:cs="Times New Roman"/>
+          <w:noProof/>
           <w:sz w:val="28"/>
           <w:szCs w:val="28"/>
         </w:rPr>
@@ -27787,6 +28114,7 @@
       <w:r>
         <w:rPr>
           <w:rFonts w:ascii="Times New Roman" w:hAnsi="Times New Roman" w:cs="Times New Roman"/>
+          <w:noProof/>
           <w:sz w:val="28"/>
           <w:szCs w:val="28"/>
         </w:rPr>
@@ -27861,6 +28189,7 @@
       <w:r>
         <w:rPr>
           <w:rFonts w:ascii="Times New Roman" w:hAnsi="Times New Roman" w:cs="Times New Roman"/>
+          <w:noProof/>
           <w:sz w:val="28"/>
           <w:szCs w:val="28"/>
         </w:rPr>
@@ -34418,6 +34747,7 @@
       <w:r>
         <w:rPr>
           <w:rFonts w:ascii="Times New Roman" w:hAnsi="Times New Roman" w:cs="Times New Roman"/>
+          <w:noProof/>
           <w:sz w:val="28"/>
           <w:szCs w:val="28"/>
         </w:rPr>

</xml_diff>